<commit_message>
Strengthen theory, replication framing, and declarations
</commit_message>
<xml_diff>
--- a/publication/bangladesh_climate_destination_choice_claim_sheet.docx
+++ b/publication/bangladesh_climate_destination_choice_claim_sheet.docx
@@ -39,7 +39,7 @@
           <w:rFonts w:ascii="Aptos" w:hAnsi="Aptos"/>
           <w:sz w:val="17"/>
         </w:rPr>
-        <w:t>Shail Belani | Northwestern University | Global Poverty Research Lab</w:t>
+        <w:t>Shail Belani | Undergraduate Researcher, Northwestern University</w:t>
       </w:r>
     </w:p>
     <w:p>
@@ -79,6 +79,32 @@
           <w:color w:val="D96B2B"/>
           <w:sz w:val="16"/>
         </w:rPr>
+        <w:t>DIFFERENT QUESTION</w:t>
+      </w:r>
+    </w:p>
+    <w:p>
+      <w:pPr>
+        <w:spacing w:after="60"/>
+      </w:pPr>
+      <w:r>
+        <w:rPr>
+          <w:rFonts w:ascii="Aptos" w:hAnsi="Aptos"/>
+          <w:sz w:val="18"/>
+        </w:rPr>
+        <w:t>Prior BEMP research estimates whether shocks change migration likelihood, type, and distance. This project conditions on an observed move and predicts the destination district. BIHS supplies the independent replication and main transport tests; BEMP supplies stronger shock timing.</w:t>
+      </w:r>
+    </w:p>
+    <w:p>
+      <w:pPr>
+        <w:spacing w:before="80" w:after="20"/>
+      </w:pPr>
+      <w:r>
+        <w:rPr>
+          <w:rFonts w:ascii="Aptos" w:hAnsi="Aptos"/>
+          <w:b/>
+          <w:color w:val="D96B2B"/>
+          <w:sz w:val="16"/>
+        </w:rPr>
         <w:t>PRIMARY ESTIMATES</w:t>
       </w:r>
     </w:p>
@@ -91,7 +117,7 @@
           <w:rFonts w:ascii="Aptos" w:hAnsi="Aptos"/>
           <w:sz w:val="18"/>
         </w:rPr>
-        <w:t>BEMP shock-linked moves: 184 events, gain 0.108 [0.023, 0.189]. BIHS erosion moves: 123 events, gain 0.098 [0.028, 0.163]. BIHS national migrants: 1,857 events, gain 0.108 [0.082, 0.135]. Positive gain equals gravity log loss minus GIS log loss.</w:t>
+        <w:t>BIHS national migrants: 1,857 events, gain 0.108 [0.082, 0.135]. BIHS erosion moves: 123 events, gain 0.098 [0.028, 0.163]. BEMP shock-linked moves: 184 events, gain 0.108 [0.023, 0.189]. Positive gain equals gravity log loss minus GIS log loss.</w:t>
       </w:r>
     </w:p>
     <w:p>

</xml_diff>